<commit_message>
Updated Business Process Doc with plan changes
</commit_message>
<xml_diff>
--- a/Business Process Documentation.docx
+++ b/Business Process Documentation.docx
@@ -95,16 +95,23 @@
     </w:p>
     <w:p>
       <w:pPr>
-        <w:spacing w:line="240" w:lineRule="auto"/>
-        <w:ind w:left="0" w:firstLine="0"/>
-        <w:rPr>
-          <w:rFonts w:ascii="Times New Roman" w:cs="Times New Roman" w:eastAsia="Times New Roman" w:hAnsi="Times New Roman"/>
-        </w:rPr>
-      </w:pPr>
-      <w:r>
-        <w:rPr>
-          <w:rtl w:val="0"/>
-        </w:rPr>
+        <w:numPr>
+          <w:ilvl w:val="0"/>
+          <w:numId w:val="1"/>
+        </w:numPr>
+        <w:spacing w:line="240" w:lineRule="auto"/>
+        <w:ind w:left="720" w:hanging="360"/>
+        <w:rPr>
+          <w:rFonts w:ascii="Times New Roman" w:cs="Times New Roman" w:eastAsia="Times New Roman" w:hAnsi="Times New Roman"/>
+          <w:u w:val="none"/>
+        </w:rPr>
+      </w:pPr>
+      <w:r>
+        <w:rPr>
+          <w:rFonts w:ascii="Times New Roman" w:cs="Times New Roman" w:eastAsia="Times New Roman" w:hAnsi="Times New Roman"/>
+          <w:rtl w:val="0"/>
+        </w:rPr>
+        <w:t xml:space="preserve">Plan Changes</w:t>
       </w:r>
     </w:p>
     <w:p>
@@ -957,6 +964,509 @@
           <w:rtl w:val="0"/>
         </w:rPr>
         <w:t xml:space="preserve">Dilakukan dokumentasi yang baik</w:t>
+      </w:r>
+    </w:p>
+    <w:p>
+      <w:pPr>
+        <w:spacing w:line="240" w:lineRule="auto"/>
+        <w:ind w:left="0" w:firstLine="0"/>
+        <w:rPr>
+          <w:rFonts w:ascii="Times New Roman" w:cs="Times New Roman" w:eastAsia="Times New Roman" w:hAnsi="Times New Roman"/>
+          <w:b w:val="1"/>
+          <w:bCs w:val="1"/>
+          <w:sz w:val="32"/>
+          <w:szCs w:val="32"/>
+        </w:rPr>
+      </w:pPr>
+      <w:r>
+        <w:rPr>
+          <w:rFonts w:ascii="Times New Roman" w:cs="Times New Roman" w:eastAsia="Times New Roman" w:hAnsi="Times New Roman"/>
+          <w:b w:val="1"/>
+          <w:bCs w:val="1"/>
+          <w:sz w:val="32"/>
+          <w:szCs w:val="32"/>
+          <w:rtl w:val="0"/>
+        </w:rPr>
+        <w:t xml:space="preserve">Plan Changes</w:t>
+      </w:r>
+    </w:p>
+    <w:p>
+      <w:pPr>
+        <w:spacing w:line="240" w:lineRule="auto"/>
+        <w:rPr>
+          <w:rFonts w:ascii="Times New Roman" w:cs="Times New Roman" w:eastAsia="Times New Roman" w:hAnsi="Times New Roman"/>
+          <w:b w:val="1"/>
+          <w:bCs w:val="1"/>
+          <w:sz w:val="32"/>
+          <w:szCs w:val="32"/>
+        </w:rPr>
+      </w:pPr>
+      <w:r>
+        <w:rPr>
+          <w:rtl w:val="0"/>
+        </w:rPr>
+      </w:r>
+    </w:p>
+    <w:p>
+      <w:pPr>
+        <w:spacing w:line="240" w:lineRule="auto"/>
+        <w:rPr>
+          <w:rFonts w:ascii="Times New Roman" w:cs="Times New Roman" w:eastAsia="Times New Roman" w:hAnsi="Times New Roman"/>
+          <w:sz w:val="24"/>
+          <w:szCs w:val="24"/>
+        </w:rPr>
+      </w:pPr>
+      <w:r>
+        <w:rPr>
+          <w:rFonts w:ascii="Times New Roman" w:cs="Times New Roman" w:eastAsia="Times New Roman" w:hAnsi="Times New Roman"/>
+          <w:sz w:val="24"/>
+          <w:szCs w:val="24"/>
+          <w:rtl w:val="0"/>
+        </w:rPr>
+        <w:t xml:space="preserve">Karena proyek </w:t>
+      </w:r>
+      <w:r>
+        <w:rPr>
+          <w:rFonts w:ascii="Times New Roman" w:cs="Times New Roman" w:eastAsia="Times New Roman" w:hAnsi="Times New Roman"/>
+          <w:i w:val="1"/>
+          <w:iCs w:val="1"/>
+          <w:sz w:val="24"/>
+          <w:szCs w:val="24"/>
+          <w:rtl w:val="0"/>
+        </w:rPr>
+        <w:t xml:space="preserve">Agile</w:t>
+      </w:r>
+      <w:r>
+        <w:rPr>
+          <w:rFonts w:ascii="Times New Roman" w:cs="Times New Roman" w:eastAsia="Times New Roman" w:hAnsi="Times New Roman"/>
+          <w:sz w:val="24"/>
+          <w:szCs w:val="24"/>
+          <w:rtl w:val="0"/>
+        </w:rPr>
+        <w:t xml:space="preserve"> yang bersifat fluktuatif. Akan dibuat sebuah prosedur untuk menangani dan menyaring segala bentuk perubahan yang muncul selama proyek. Dengan demikian perubahan tidak akan mempengaruhi </w:t>
+      </w:r>
+      <w:r>
+        <w:rPr>
+          <w:rFonts w:ascii="Times New Roman" w:cs="Times New Roman" w:eastAsia="Times New Roman" w:hAnsi="Times New Roman"/>
+          <w:i w:val="1"/>
+          <w:iCs w:val="1"/>
+          <w:sz w:val="24"/>
+          <w:szCs w:val="24"/>
+          <w:rtl w:val="0"/>
+        </w:rPr>
+        <w:t xml:space="preserve">timeline</w:t>
+      </w:r>
+      <w:r>
+        <w:rPr>
+          <w:rFonts w:ascii="Times New Roman" w:cs="Times New Roman" w:eastAsia="Times New Roman" w:hAnsi="Times New Roman"/>
+          <w:sz w:val="24"/>
+          <w:szCs w:val="24"/>
+          <w:rtl w:val="0"/>
+        </w:rPr>
+        <w:t xml:space="preserve"> sprint. Prosedur pengajuan perubahan adalah sebagai berikut: </w:t>
+      </w:r>
+    </w:p>
+    <w:p>
+      <w:pPr>
+        <w:spacing w:line="240" w:lineRule="auto"/>
+        <w:rPr>
+          <w:rFonts w:ascii="Times New Roman" w:cs="Times New Roman" w:eastAsia="Times New Roman" w:hAnsi="Times New Roman"/>
+          <w:sz w:val="24"/>
+          <w:szCs w:val="24"/>
+        </w:rPr>
+      </w:pPr>
+      <w:r>
+        <w:rPr>
+          <w:rtl w:val="0"/>
+        </w:rPr>
+      </w:r>
+    </w:p>
+    <w:p>
+      <w:pPr>
+        <w:keepNext w:val="0"/>
+        <w:keepLines w:val="0"/>
+        <w:numPr>
+          <w:ilvl w:val="0"/>
+          <w:numId w:val="3"/>
+        </w:numPr>
+        <w:spacing w:after="80" w:line="240" w:lineRule="auto"/>
+        <w:ind w:left="720" w:hanging="360"/>
+        <w:rPr>
+          <w:sz w:val="24"/>
+          <w:szCs w:val="24"/>
+        </w:rPr>
+      </w:pPr>
+      <w:r>
+        <w:rPr>
+          <w:rFonts w:ascii="Times New Roman" w:cs="Times New Roman" w:eastAsia="Times New Roman" w:hAnsi="Times New Roman"/>
+          <w:b w:val="1"/>
+          <w:bCs w:val="1"/>
+          <w:sz w:val="24"/>
+          <w:szCs w:val="24"/>
+          <w:rtl w:val="0"/>
+        </w:rPr>
+        <w:t xml:space="preserve">Mengajukan Perubahan</w:t>
+      </w:r>
+    </w:p>
+    <w:p>
+      <w:pPr>
+        <w:ind w:left="720" w:firstLine="0"/>
+        <w:rPr>
+          <w:rFonts w:ascii="Times New Roman" w:cs="Times New Roman" w:eastAsia="Times New Roman" w:hAnsi="Times New Roman"/>
+          <w:sz w:val="24"/>
+          <w:szCs w:val="24"/>
+        </w:rPr>
+      </w:pPr>
+      <w:r>
+        <w:rPr>
+          <w:rFonts w:ascii="Times New Roman" w:cs="Times New Roman" w:eastAsia="Times New Roman" w:hAnsi="Times New Roman"/>
+          <w:sz w:val="24"/>
+          <w:szCs w:val="24"/>
+          <w:rtl w:val="0"/>
+        </w:rPr>
+        <w:t xml:space="preserve">Pemohon mengirimkan Formulir Permohonan Perubahan ke Product Owner dengan format judul, alasan, nilai bisni dan urgensi</w:t>
+      </w:r>
+    </w:p>
+    <w:p>
+      <w:pPr>
+        <w:ind w:left="720" w:firstLine="0"/>
+        <w:rPr>
+          <w:rFonts w:ascii="Times New Roman" w:cs="Times New Roman" w:eastAsia="Times New Roman" w:hAnsi="Times New Roman"/>
+          <w:sz w:val="24"/>
+          <w:szCs w:val="24"/>
+        </w:rPr>
+      </w:pPr>
+      <w:r>
+        <w:rPr>
+          <w:rtl w:val="0"/>
+        </w:rPr>
+      </w:r>
+    </w:p>
+    <w:p>
+      <w:pPr>
+        <w:keepNext w:val="0"/>
+        <w:keepLines w:val="0"/>
+        <w:numPr>
+          <w:ilvl w:val="0"/>
+          <w:numId w:val="3"/>
+        </w:numPr>
+        <w:spacing w:after="80" w:line="240" w:lineRule="auto"/>
+        <w:ind w:left="720" w:hanging="360"/>
+        <w:rPr>
+          <w:sz w:val="24"/>
+          <w:szCs w:val="24"/>
+        </w:rPr>
+      </w:pPr>
+      <w:r>
+        <w:rPr>
+          <w:rFonts w:ascii="Times New Roman" w:cs="Times New Roman" w:eastAsia="Times New Roman" w:hAnsi="Times New Roman"/>
+          <w:b w:val="1"/>
+          <w:bCs w:val="1"/>
+          <w:sz w:val="24"/>
+          <w:szCs w:val="24"/>
+          <w:rtl w:val="0"/>
+        </w:rPr>
+        <w:t xml:space="preserve">Penilaian Dampak</w:t>
+      </w:r>
+    </w:p>
+    <w:p>
+      <w:pPr>
+        <w:ind w:left="720" w:firstLine="0"/>
+        <w:rPr>
+          <w:rFonts w:ascii="Times New Roman" w:cs="Times New Roman" w:eastAsia="Times New Roman" w:hAnsi="Times New Roman"/>
+          <w:sz w:val="24"/>
+          <w:szCs w:val="24"/>
+        </w:rPr>
+      </w:pPr>
+      <w:r>
+        <w:rPr>
+          <w:rFonts w:ascii="Times New Roman" w:cs="Times New Roman" w:eastAsia="Times New Roman" w:hAnsi="Times New Roman"/>
+          <w:sz w:val="24"/>
+          <w:szCs w:val="24"/>
+          <w:rtl w:val="0"/>
+        </w:rPr>
+        <w:t xml:space="preserve">Product Owner dan Scrum Master mengevaluasi apakah perubahan memang diperlukan dan dampaknya terhadap sistem serta proyek. Jika diterima, perubahan akan masuk Product Backlog.</w:t>
+      </w:r>
+    </w:p>
+    <w:p>
+      <w:pPr>
+        <w:ind w:left="720" w:firstLine="0"/>
+        <w:rPr>
+          <w:rFonts w:ascii="Times New Roman" w:cs="Times New Roman" w:eastAsia="Times New Roman" w:hAnsi="Times New Roman"/>
+          <w:sz w:val="24"/>
+          <w:szCs w:val="24"/>
+        </w:rPr>
+      </w:pPr>
+      <w:r>
+        <w:rPr>
+          <w:rtl w:val="0"/>
+        </w:rPr>
+      </w:r>
+    </w:p>
+    <w:p>
+      <w:pPr>
+        <w:keepNext w:val="0"/>
+        <w:keepLines w:val="0"/>
+        <w:numPr>
+          <w:ilvl w:val="0"/>
+          <w:numId w:val="3"/>
+        </w:numPr>
+        <w:spacing w:after="80" w:line="240" w:lineRule="auto"/>
+        <w:ind w:left="720" w:hanging="360"/>
+        <w:rPr>
+          <w:sz w:val="24"/>
+          <w:szCs w:val="24"/>
+        </w:rPr>
+      </w:pPr>
+      <w:r>
+        <w:rPr>
+          <w:rFonts w:ascii="Times New Roman" w:cs="Times New Roman" w:eastAsia="Times New Roman" w:hAnsi="Times New Roman"/>
+          <w:b w:val="1"/>
+          <w:bCs w:val="1"/>
+          <w:sz w:val="24"/>
+          <w:szCs w:val="24"/>
+          <w:rtl w:val="0"/>
+        </w:rPr>
+        <w:t xml:space="preserve">Prioritization</w:t>
+      </w:r>
+    </w:p>
+    <w:p>
+      <w:pPr>
+        <w:ind w:left="720" w:firstLine="0"/>
+        <w:rPr>
+          <w:rFonts w:ascii="Times New Roman" w:cs="Times New Roman" w:eastAsia="Times New Roman" w:hAnsi="Times New Roman"/>
+          <w:sz w:val="24"/>
+          <w:szCs w:val="24"/>
+        </w:rPr>
+      </w:pPr>
+      <w:r>
+        <w:rPr>
+          <w:rFonts w:ascii="Times New Roman" w:cs="Times New Roman" w:eastAsia="Times New Roman" w:hAnsi="Times New Roman"/>
+          <w:sz w:val="24"/>
+          <w:szCs w:val="24"/>
+          <w:rtl w:val="0"/>
+        </w:rPr>
+        <w:t xml:space="preserve">Perubahan tidak akan langsung masuk pada sprint yang sedang berjalan tetapi dieksekusi sesuai tingkat urgensinya. Jika kondisi darurat, akan dilakukan stop-the-line dan dilakukan penambahan Product Backlog baru</w:t>
+      </w:r>
+    </w:p>
+    <w:p>
+      <w:pPr>
+        <w:ind w:left="720" w:firstLine="0"/>
+        <w:rPr>
+          <w:rFonts w:ascii="Times New Roman" w:cs="Times New Roman" w:eastAsia="Times New Roman" w:hAnsi="Times New Roman"/>
+          <w:sz w:val="24"/>
+          <w:szCs w:val="24"/>
+        </w:rPr>
+      </w:pPr>
+      <w:r>
+        <w:rPr>
+          <w:rtl w:val="0"/>
+        </w:rPr>
+      </w:r>
+    </w:p>
+    <w:p>
+      <w:pPr>
+        <w:keepNext w:val="0"/>
+        <w:keepLines w:val="0"/>
+        <w:numPr>
+          <w:ilvl w:val="0"/>
+          <w:numId w:val="3"/>
+        </w:numPr>
+        <w:spacing w:after="80" w:line="240" w:lineRule="auto"/>
+        <w:ind w:left="720" w:hanging="360"/>
+        <w:rPr>
+          <w:sz w:val="24"/>
+          <w:szCs w:val="24"/>
+        </w:rPr>
+      </w:pPr>
+      <w:r>
+        <w:rPr>
+          <w:rFonts w:ascii="Times New Roman" w:cs="Times New Roman" w:eastAsia="Times New Roman" w:hAnsi="Times New Roman"/>
+          <w:b w:val="1"/>
+          <w:bCs w:val="1"/>
+          <w:sz w:val="24"/>
+          <w:szCs w:val="24"/>
+          <w:rtl w:val="0"/>
+        </w:rPr>
+        <w:t xml:space="preserve">Sprint Planning &amp; Penjadwalan</w:t>
+      </w:r>
+    </w:p>
+    <w:p>
+      <w:pPr>
+        <w:ind w:left="720" w:firstLine="0"/>
+        <w:rPr>
+          <w:rFonts w:ascii="Times New Roman" w:cs="Times New Roman" w:eastAsia="Times New Roman" w:hAnsi="Times New Roman"/>
+          <w:sz w:val="24"/>
+          <w:szCs w:val="24"/>
+        </w:rPr>
+      </w:pPr>
+      <w:r>
+        <w:rPr>
+          <w:rFonts w:ascii="Times New Roman" w:cs="Times New Roman" w:eastAsia="Times New Roman" w:hAnsi="Times New Roman"/>
+          <w:sz w:val="24"/>
+          <w:szCs w:val="24"/>
+          <w:rtl w:val="0"/>
+        </w:rPr>
+        <w:t xml:space="preserve">Product Backlog baru disetujui seluruh anggota tim dan dipilih untuk dipindahkan ke Sprint Backlog </w:t>
+      </w:r>
+    </w:p>
+    <w:p>
+      <w:pPr>
+        <w:ind w:left="720" w:firstLine="0"/>
+        <w:rPr>
+          <w:rFonts w:ascii="Times New Roman" w:cs="Times New Roman" w:eastAsia="Times New Roman" w:hAnsi="Times New Roman"/>
+          <w:sz w:val="24"/>
+          <w:szCs w:val="24"/>
+        </w:rPr>
+      </w:pPr>
+      <w:r>
+        <w:rPr>
+          <w:rtl w:val="0"/>
+        </w:rPr>
+      </w:r>
+    </w:p>
+    <w:p>
+      <w:pPr>
+        <w:keepNext w:val="0"/>
+        <w:keepLines w:val="0"/>
+        <w:numPr>
+          <w:ilvl w:val="0"/>
+          <w:numId w:val="3"/>
+        </w:numPr>
+        <w:spacing w:after="80" w:line="240" w:lineRule="auto"/>
+        <w:ind w:left="720" w:hanging="360"/>
+        <w:rPr>
+          <w:sz w:val="24"/>
+          <w:szCs w:val="24"/>
+        </w:rPr>
+      </w:pPr>
+      <w:r>
+        <w:rPr>
+          <w:rFonts w:ascii="Times New Roman" w:cs="Times New Roman" w:eastAsia="Times New Roman" w:hAnsi="Times New Roman"/>
+          <w:b w:val="1"/>
+          <w:bCs w:val="1"/>
+          <w:sz w:val="24"/>
+          <w:szCs w:val="24"/>
+          <w:rtl w:val="0"/>
+        </w:rPr>
+        <w:t xml:space="preserve">Implementasi</w:t>
+        <w:br w:type="textWrapping"/>
+      </w:r>
+      <w:r>
+        <w:rPr>
+          <w:rFonts w:ascii="Times New Roman" w:cs="Times New Roman" w:eastAsia="Times New Roman" w:hAnsi="Times New Roman"/>
+          <w:sz w:val="24"/>
+          <w:szCs w:val="24"/>
+          <w:rtl w:val="0"/>
+        </w:rPr>
+        <w:t xml:space="preserve">Tim mengerjakan sesuai Sprint Backlog</w:t>
+      </w:r>
+    </w:p>
+    <w:p>
+      <w:pPr>
+        <w:keepNext w:val="0"/>
+        <w:keepLines w:val="0"/>
+        <w:spacing w:after="80" w:line="240" w:lineRule="auto"/>
+        <w:ind w:left="720" w:firstLine="0"/>
+        <w:rPr>
+          <w:rFonts w:ascii="Times New Roman" w:cs="Times New Roman" w:eastAsia="Times New Roman" w:hAnsi="Times New Roman"/>
+          <w:sz w:val="24"/>
+          <w:szCs w:val="24"/>
+        </w:rPr>
+      </w:pPr>
+      <w:r>
+        <w:rPr>
+          <w:rtl w:val="0"/>
+        </w:rPr>
+      </w:r>
+    </w:p>
+    <w:p>
+      <w:pPr>
+        <w:keepNext w:val="0"/>
+        <w:keepLines w:val="0"/>
+        <w:numPr>
+          <w:ilvl w:val="0"/>
+          <w:numId w:val="3"/>
+        </w:numPr>
+        <w:spacing w:after="80" w:line="240" w:lineRule="auto"/>
+        <w:ind w:left="720" w:hanging="360"/>
+        <w:rPr>
+          <w:sz w:val="24"/>
+          <w:szCs w:val="24"/>
+        </w:rPr>
+      </w:pPr>
+      <w:r>
+        <w:rPr>
+          <w:rFonts w:ascii="Times New Roman" w:cs="Times New Roman" w:eastAsia="Times New Roman" w:hAnsi="Times New Roman"/>
+          <w:b w:val="1"/>
+          <w:bCs w:val="1"/>
+          <w:sz w:val="24"/>
+          <w:szCs w:val="24"/>
+          <w:rtl w:val="0"/>
+        </w:rPr>
+        <w:t xml:space="preserve">Review &amp; Validasi</w:t>
+        <w:br w:type="textWrapping"/>
+      </w:r>
+      <w:r>
+        <w:rPr>
+          <w:rFonts w:ascii="Times New Roman" w:cs="Times New Roman" w:eastAsia="Times New Roman" w:hAnsi="Times New Roman"/>
+          <w:sz w:val="24"/>
+          <w:szCs w:val="24"/>
+          <w:rtl w:val="0"/>
+        </w:rPr>
+        <w:t xml:space="preserve">PO dan stakeholder memverifikasi apakah perubahan memenuhi kebutuhan. Jika ada revisi tambahan, kembali ke langkah 1</w:t>
+      </w:r>
+    </w:p>
+    <w:p>
+      <w:pPr>
+        <w:keepNext w:val="0"/>
+        <w:keepLines w:val="0"/>
+        <w:spacing w:after="80" w:line="240" w:lineRule="auto"/>
+        <w:ind w:left="720" w:firstLine="0"/>
+        <w:rPr>
+          <w:rFonts w:ascii="Times New Roman" w:cs="Times New Roman" w:eastAsia="Times New Roman" w:hAnsi="Times New Roman"/>
+          <w:sz w:val="24"/>
+          <w:szCs w:val="24"/>
+        </w:rPr>
+      </w:pPr>
+      <w:r>
+        <w:rPr>
+          <w:rtl w:val="0"/>
+        </w:rPr>
+      </w:r>
+    </w:p>
+    <w:p>
+      <w:pPr>
+        <w:numPr>
+          <w:ilvl w:val="0"/>
+          <w:numId w:val="3"/>
+        </w:numPr>
+        <w:ind w:left="720" w:hanging="360"/>
+        <w:rPr>
+          <w:sz w:val="24"/>
+          <w:szCs w:val="24"/>
+        </w:rPr>
+      </w:pPr>
+      <w:r>
+        <w:rPr>
+          <w:rFonts w:ascii="Times New Roman" w:cs="Times New Roman" w:eastAsia="Times New Roman" w:hAnsi="Times New Roman"/>
+          <w:b w:val="1"/>
+          <w:bCs w:val="1"/>
+          <w:sz w:val="24"/>
+          <w:szCs w:val="24"/>
+          <w:rtl w:val="0"/>
+        </w:rPr>
+        <w:t xml:space="preserve">Dokumentasi</w:t>
+        <w:br w:type="textWrapping"/>
+      </w:r>
+      <w:r>
+        <w:rPr>
+          <w:rFonts w:ascii="Times New Roman" w:cs="Times New Roman" w:eastAsia="Times New Roman" w:hAnsi="Times New Roman"/>
+          <w:sz w:val="24"/>
+          <w:szCs w:val="24"/>
+          <w:rtl w:val="0"/>
+        </w:rPr>
+        <w:t xml:space="preserve">Tambahkan catatan perubahan </w:t>
       </w:r>
     </w:p>
     <w:sectPr>
@@ -1190,11 +1700,127 @@
       </w:rPr>
     </w:lvl>
   </w:abstractNum>
+  <w:abstractNum w:abstractNumId="3">
+    <w:lvl w:ilvl="0">
+      <w:start w:val="1"/>
+      <w:numFmt w:val="decimal"/>
+      <w:lvlText w:val="%1."/>
+      <w:lvlJc w:val="left"/>
+      <w:pPr>
+        <w:ind w:left="720" w:hanging="360"/>
+      </w:pPr>
+      <w:rPr>
+        <w:rFonts w:ascii="Times New Roman" w:cs="Times New Roman" w:eastAsia="Times New Roman" w:hAnsi="Times New Roman"/>
+        <w:b w:val="0"/>
+        <w:bCs w:val="0"/>
+        <w:u w:val="none"/>
+      </w:rPr>
+    </w:lvl>
+    <w:lvl w:ilvl="1">
+      <w:start w:val="1"/>
+      <w:numFmt w:val="lowerLetter"/>
+      <w:lvlText w:val="%2."/>
+      <w:lvlJc w:val="left"/>
+      <w:pPr>
+        <w:ind w:left="1440" w:hanging="360"/>
+      </w:pPr>
+      <w:rPr>
+        <w:u w:val="none"/>
+      </w:rPr>
+    </w:lvl>
+    <w:lvl w:ilvl="2">
+      <w:start w:val="1"/>
+      <w:numFmt w:val="lowerRoman"/>
+      <w:lvlText w:val="%3."/>
+      <w:lvlJc w:val="right"/>
+      <w:pPr>
+        <w:ind w:left="2160" w:hanging="360"/>
+      </w:pPr>
+      <w:rPr>
+        <w:u w:val="none"/>
+      </w:rPr>
+    </w:lvl>
+    <w:lvl w:ilvl="3">
+      <w:start w:val="1"/>
+      <w:numFmt w:val="decimal"/>
+      <w:lvlText w:val="%4."/>
+      <w:lvlJc w:val="left"/>
+      <w:pPr>
+        <w:ind w:left="2880" w:hanging="360"/>
+      </w:pPr>
+      <w:rPr>
+        <w:u w:val="none"/>
+      </w:rPr>
+    </w:lvl>
+    <w:lvl w:ilvl="4">
+      <w:start w:val="1"/>
+      <w:numFmt w:val="lowerLetter"/>
+      <w:lvlText w:val="%5."/>
+      <w:lvlJc w:val="left"/>
+      <w:pPr>
+        <w:ind w:left="3600" w:hanging="360"/>
+      </w:pPr>
+      <w:rPr>
+        <w:u w:val="none"/>
+      </w:rPr>
+    </w:lvl>
+    <w:lvl w:ilvl="5">
+      <w:start w:val="1"/>
+      <w:numFmt w:val="lowerRoman"/>
+      <w:lvlText w:val="%6."/>
+      <w:lvlJc w:val="right"/>
+      <w:pPr>
+        <w:ind w:left="4320" w:hanging="360"/>
+      </w:pPr>
+      <w:rPr>
+        <w:u w:val="none"/>
+      </w:rPr>
+    </w:lvl>
+    <w:lvl w:ilvl="6">
+      <w:start w:val="1"/>
+      <w:numFmt w:val="decimal"/>
+      <w:lvlText w:val="%7."/>
+      <w:lvlJc w:val="left"/>
+      <w:pPr>
+        <w:ind w:left="5040" w:hanging="360"/>
+      </w:pPr>
+      <w:rPr>
+        <w:u w:val="none"/>
+      </w:rPr>
+    </w:lvl>
+    <w:lvl w:ilvl="7">
+      <w:start w:val="1"/>
+      <w:numFmt w:val="lowerLetter"/>
+      <w:lvlText w:val="%8."/>
+      <w:lvlJc w:val="left"/>
+      <w:pPr>
+        <w:ind w:left="5760" w:hanging="360"/>
+      </w:pPr>
+      <w:rPr>
+        <w:u w:val="none"/>
+      </w:rPr>
+    </w:lvl>
+    <w:lvl w:ilvl="8">
+      <w:start w:val="1"/>
+      <w:numFmt w:val="lowerRoman"/>
+      <w:lvlText w:val="%9."/>
+      <w:lvlJc w:val="right"/>
+      <w:pPr>
+        <w:ind w:left="6480" w:hanging="360"/>
+      </w:pPr>
+      <w:rPr>
+        <w:u w:val="none"/>
+      </w:rPr>
+    </w:lvl>
+  </w:abstractNum>
   <w:num w:numId="1">
     <w:abstractNumId w:val="1"/>
   </w:num>
   <w:num w:numId="2">
     <w:abstractNumId w:val="2"/>
+  </w:num>
+  <w:num w:numId="3">
+    <w:abstractNumId w:val="3"/>
   </w:num>
 </w:numbering>
 </file>

</xml_diff>